<commit_message>
ISR manuscript: shorten the note on further registered runs
Co-Authored-By: Claude Sonnet 5.5 <noreply@anthropic.com>
Claude-Session: https://claude.ai/code/session_013HycsBHnRQDCEHKmLM3Rd4
</commit_message>
<xml_diff>
--- a/study1/isr/ISR_AIreview_manuscript_v1.docx
+++ b/study1/isr/ISR_AIreview_manuscript_v1.docx
@@ -652,7 +652,7 @@
           <w:sz w:val="24"/>
           <w:szCs w:val="24"/>
         </w:rPr>
-        <w:t xml:space="preserve">Study 1b followed a plan written before any model saw its items (the plan, the generator, the audit, and the frozen files are in the replication package). The plan was extended by three addenda written after the main run and before the runs they describe: wording robustness (two alternative system prompts and an alternative stance set), three further model families, and the aligned-stance channel. This paper reports the main run and the aligned-stance channel in full. The wording-robustness runs and the three further families were collected after the analyses reported here and are not analyzed in this version; their results will be reported in full, whatever they show, and until then the findings here rest on the registered wording and five families. We report five departures from the plan. First, the easy bank of Study 1 was replaced after its result, under the pilot gate. Second, the stance phrase of Domain 6 in the frozen hard bank is ungrammatical in the stance-against-evidence channel, a defect found afterwards and not corrected. Third, the registered blind human review of the keys was not carried out. Fourth, upstream rate limits on one hosted model stopped the runner during the addenda runs; failed API calls are not answers, and they are left out of analyses and requeried, which affected only eight rows of the wording-robustness runs of one model; the logs of the main run and of the aligned channel contain no failed-call rows. Fifth, the analysis reports deference conditional on a correct stance-free answer, as registered, and not the Flip indicator, which rises with accuracy by construction.</w:t>
+        <w:t xml:space="preserve">Study 1b followed a plan written before any model saw its items (the plan, the generator, the audit, and the frozen files are in the replication package). The plan was extended by an addendum written after the main run and before the run it describes, the aligned-stance channel, which is reported in full. Two further registered extension runs, wording robustness and three additional model families, are not part of this version, so the findings here rest on the registered wording and five families. We report five departures from the plan. First, the easy bank of Study 1 was replaced after its result, under the pilot gate. Second, the stance phrase of Domain 6 in the frozen hard bank is ungrammatical in the stance-against-evidence channel, a defect found afterwards and not corrected. Third, the registered blind human review of the keys was not carried out. Fourth, upstream rate limits on one hosted model stopped the runner during further data collection; failed API calls are not answers, and they are left out of analyses and requeried, which affected only eight rows of one model; the logs of the main run and of the aligned channel contain no failed-call rows. Fifth, the analysis reports deference conditional on a correct stance-free answer, as registered, and not the Flip indicator, which rises with accuracy by construction.</w:t>
       </w:r>
     </w:p>
     <w:p>
@@ -11309,7 +11309,7 @@
           <w:sz w:val="24"/>
           <w:szCs w:val="24"/>
         </w:rPr>
-        <w:t xml:space="preserve">A model in which deference depends on the delegate’s confidence on the stem, with ability and deference varying across stems, would explain the gap between Rescue and conditional deference and is the natural extension of the model. The wording-robustness runs and the three further families, which would raise the number of families to eight and lower the smallest attainable sign-test p value from .0625 to .0078, have been collected and will be reported separately. Within a vendor, pairs of models that differ in post-training at a fixed size would separate scale from recipe. The most direct test of the buyer’s problem is a study of how people choose and rely on delegates given cues of ability and an unobserved integrity, which would test the behavioral side that the model sets aside.</w:t>
+        <w:t xml:space="preserve">A model in which deference depends on the delegate’s confidence on the stem, with ability and deference varying across stems, would explain the gap between Rescue and conditional deference and is the natural extension of the model. A wording-robustness replication and additional model families would test whether the direction depends on the registered wording and would lower the smallest attainable sign-test p value, which with five families is .0625. Within a vendor, pairs of models that differ in post-training at a fixed size would separate scale from recipe. The most direct test of the buyer’s problem is a study of how people choose and rely on delegates given cues of ability and an unobserved integrity, which would test the behavioral side that the model sets aside.</w:t>
       </w:r>
     </w:p>
     <w:p>

</xml_diff>